<commit_message>
Update README.docx: 19 categories, CSV/PDF export, Connected App Security
Co-Authored-By: Claude Sonnet 4.6 <noreply@anthropic.com>
</commit_message>
<xml_diff>
--- a/docs/SF_Tech_Debt_Assessor_README.docx
+++ b/docs/SF_Tech_Debt_Assessor_README.docx
@@ -44,7 +44,7 @@
         <w:rPr>
           <w:sz w:val="20"/>
         </w:rPr>
-        <w:t>A web app that connects to any Salesforce org and produces a scored technical debt report across 18 categories. Each issue includes an expandable list of the specific records, rules, users, or components causing the score reduction.</w:t>
+        <w:t>A web app that connects to any Salesforce org and produces a scored technical debt report across 19 categories. Each issue includes an expandable list of the specific records, rules, users, or components causing the score reduction.</w:t>
       </w:r>
     </w:p>
     <w:p>
@@ -1370,7 +1370,55 @@
         <w:rPr>
           <w:sz w:val="20"/>
         </w:rPr>
-        <w:t>Export results as PDF when done</w:t>
+        <w:t>Export results:</w:t>
+      </w:r>
+    </w:p>
+    <w:p>
+      <w:pPr>
+        <w:spacing w:after="80"/>
+      </w:pPr>
+      <w:r>
+        <w:rPr>
+          <w:sz w:val="20"/>
+        </w:rPr>
+        <w:t xml:space="preserve">   - </w:t>
+      </w:r>
+      <w:r>
+        <w:rPr>
+          <w:b/>
+          <w:sz w:val="20"/>
+        </w:rPr>
+        <w:t>Export PDF</w:t>
+      </w:r>
+      <w:r>
+        <w:rPr>
+          <w:sz w:val="20"/>
+        </w:rPr>
+        <w:t xml:space="preserve"> — full report with category scores, findings, recommendations, and affected records per issue. Ideal for customer presentations.</w:t>
+      </w:r>
+    </w:p>
+    <w:p>
+      <w:pPr>
+        <w:spacing w:after="80"/>
+      </w:pPr>
+      <w:r>
+        <w:rPr>
+          <w:sz w:val="20"/>
+        </w:rPr>
+        <w:t xml:space="preserve">   - </w:t>
+      </w:r>
+      <w:r>
+        <w:rPr>
+          <w:b/>
+          <w:sz w:val="20"/>
+        </w:rPr>
+        <w:t>Export CSV</w:t>
+      </w:r>
+      <w:r>
+        <w:rPr>
+          <w:sz w:val="20"/>
+        </w:rPr>
+        <w:t xml:space="preserve"> — one row per affected record across all categories. Opens directly in Excel. Ideal for building a remediation backlog.</w:t>
       </w:r>
     </w:p>
     <w:p>
@@ -2158,6 +2206,45 @@
           </w:p>
         </w:tc>
       </w:tr>
+      <w:tr>
+        <w:tc>
+          <w:tcPr>
+            <w:tcW w:type="dxa" w:w="4392"/>
+          </w:tcPr>
+          <w:p>
+            <w:r>
+              <w:rPr>
+                <w:sz w:val="18"/>
+              </w:rPr>
+            </w:r>
+            <w:r>
+              <w:rPr>
+                <w:b/>
+                <w:sz w:val="18"/>
+              </w:rPr>
+              <w:t>Connected App Security</w:t>
+            </w:r>
+            <w:r>
+              <w:rPr>
+                <w:sz w:val="18"/>
+              </w:rPr>
+            </w:r>
+          </w:p>
+        </w:tc>
+        <w:tc>
+          <w:tcPr>
+            <w:tcW w:type="dxa" w:w="4392"/>
+          </w:tcPr>
+          <w:p>
+            <w:r>
+              <w:rPr>
+                <w:sz w:val="18"/>
+              </w:rPr>
+              <w:t>Session timeouts, stale OAuth tokens, high token volume, undocumented apps, duplicate app names</w:t>
+            </w:r>
+          </w:p>
+        </w:tc>
+      </w:tr>
     </w:tbl>
     <w:p/>
     <w:p>

</xml_diff>

<commit_message>
Update README.docx with latest changes
Co-Authored-By: Claude Sonnet 4.6 <noreply@anthropic.com>
</commit_message>
<xml_diff>
--- a/docs/SF_Tech_Debt_Assessor_README.docx
+++ b/docs/SF_Tech_Debt_Assessor_README.docx
@@ -1187,7 +1187,7 @@
         <w:rPr>
           <w:sz w:val="20"/>
         </w:rPr>
-        <w:t>Enter:</w:t>
+        <w:t>Enter your org credentials (auto-filled on return visits if you checked "Remember credentials"):</w:t>
       </w:r>
     </w:p>
     <w:p>
@@ -1297,7 +1297,19 @@
         <w:rPr>
           <w:sz w:val="20"/>
         </w:rPr>
-        <w:t xml:space="preserve"> and authenticate</w:t>
+        <w:t xml:space="preserve">, log in, and click </w:t>
+      </w:r>
+      <w:r>
+        <w:rPr>
+          <w:b/>
+          <w:sz w:val="20"/>
+        </w:rPr>
+        <w:t>Allow</w:t>
+      </w:r>
+      <w:r>
+        <w:rPr>
+          <w:sz w:val="20"/>
+        </w:rPr>
       </w:r>
     </w:p>
     <w:p>
@@ -1370,7 +1382,7 @@
         <w:rPr>
           <w:sz w:val="20"/>
         </w:rPr>
-        <w:t>Export results:</w:t>
+        <w:t>Export results (all exports include Org Name, Org ID, Type, Instance, and URL):</w:t>
       </w:r>
     </w:p>
     <w:p>
@@ -1412,13 +1424,37 @@
           <w:b/>
           <w:sz w:val="20"/>
         </w:rPr>
+        <w:t>Export Excel</w:t>
+      </w:r>
+      <w:r>
+        <w:rPr>
+          <w:sz w:val="20"/>
+        </w:rPr>
+        <w:t xml:space="preserve"> — one tab per category plus a Summary tab. Each tab lists findings with affected records. Opens directly in Excel.</w:t>
+      </w:r>
+    </w:p>
+    <w:p>
+      <w:pPr>
+        <w:spacing w:after="80"/>
+      </w:pPr>
+      <w:r>
+        <w:rPr>
+          <w:sz w:val="20"/>
+        </w:rPr>
+        <w:t xml:space="preserve">   - </w:t>
+      </w:r>
+      <w:r>
+        <w:rPr>
+          <w:b/>
+          <w:sz w:val="20"/>
+        </w:rPr>
         <w:t>Export CSV</w:t>
       </w:r>
       <w:r>
         <w:rPr>
           <w:sz w:val="20"/>
         </w:rPr>
-        <w:t xml:space="preserve"> — one row per affected record across all categories. Opens directly in Excel. Ideal for building a remediation backlog.</w:t>
+        <w:t xml:space="preserve"> — flat file with one row per affected record across all categories. Ideal for importing into a project tracker or remediation backlog.</w:t>
       </w:r>
     </w:p>
     <w:p>

</xml_diff>

<commit_message>
docs: update README and DOCX for 20-category assessment (add LWC)
Updated intro text from 19 to 20 categories and added Lightning Web
Components row to the assessment categories table in both the GitHub
README and the Word document.

Co-Authored-By: Claude Sonnet 4.6 <noreply@anthropic.com>
</commit_message>
<xml_diff>
--- a/docs/SF_Tech_Debt_Assessor_README.docx
+++ b/docs/SF_Tech_Debt_Assessor_README.docx
@@ -44,7 +44,7 @@
         <w:rPr>
           <w:sz w:val="20"/>
         </w:rPr>
-        <w:t>A web app that connects to any Salesforce org and produces a scored technical debt report across 19 categories. Each issue includes an expandable list of the specific records, rules, users, or components causing the score reduction.</w:t>
+        <w:t>A web app that connects to any Salesforce org and produces a scored technical debt report across 20 categories. Each issue includes an expandable list of the specific records, rules, users, or components causing the score reduction.</w:t>
       </w:r>
     </w:p>
     <w:p>
@@ -2281,6 +2281,45 @@
           </w:p>
         </w:tc>
       </w:tr>
+      <w:tr>
+        <w:tc>
+          <w:tcPr>
+            <w:tcW w:type="dxa" w:w="4392"/>
+          </w:tcPr>
+          <w:p>
+            <w:r>
+              <w:rPr>
+                <w:sz w:val="18"/>
+              </w:rPr>
+              <w:t>Lightning Web Components</w:t>
+            </w:r>
+            <w:r>
+              <w:rPr>
+                <w:b/>
+                <w:sz w:val="18"/>
+              </w:rPr>
+            </w:r>
+            <w:r>
+              <w:rPr>
+                <w:sz w:val="18"/>
+              </w:rPr>
+            </w:r>
+          </w:p>
+        </w:tc>
+        <w:tc>
+          <w:tcPr>
+            <w:tcW w:type="dxa" w:w="4392"/>
+          </w:tcPr>
+          <w:p>
+            <w:r>
+              <w:rPr>
+                <w:sz w:val="18"/>
+              </w:rPr>
+              <w:t>LWC bundles without descriptions; LWC on outdated API versions (&lt;v57); LWC on retired API versions (≤v30) — broken since Summer '25; Aura-to-LWC migration debt; Aura RENDERER complexity; Aura EVENT coupling; LWC bundles without Jest test files; stale LWC/Aura components (2+ years); modified managed package components; FlexiPage sprawl per object</w:t>
+            </w:r>
+          </w:p>
+        </w:tc>
+      </w:tr>
     </w:tbl>
     <w:p/>
     <w:p>

</xml_diff>